<commit_message>
Document public companion and controlled archive access
</commit_message>
<xml_diff>
--- a/manuscript/Study_Appendices_v1_30_Online_Availability_EN.docx
+++ b/manuscript/Study_Appendices_v1_30_Online_Availability_EN.docx
@@ -5267,7 +5267,7 @@
         <w:rPr>
           <w:color w:val="000000"/>
         </w:rPr>
-        <w:t>The supplied configuration matches the local settings but does not authenticate data generation. The benchmark and selected weights are included in the controlled-access GitHub release (Appendix C.8); dataset access and redistribution rights remain unresolved.</w:t>
+        <w:t>The supplied configuration matches the local settings but does not authenticate data generation. The raw benchmark and selected weights remain in the controlled-access GitHub archive (Appendix C.8); dataset provenance and redistribution rights remain unresolved.</w:t>
       </w:r>
     </w:p>
     <w:p>
@@ -13239,7 +13239,7 @@
         <w:spacing w:line="240" w:lineRule="auto"/>
       </w:pPr>
       <w:r>
-        <w:t>The versioned GitHub archive contains the code, data, models and evidence indexed below. Release study-artifacts-v1.30 records package identities and access instructions. Readers require repository read permission.</w:t>
+        <w:t>The public guide indexes shareable code, aggregate results and documentation. The private archive retains raw benchmark records, selected models, fitted assets, saved scores and replay inputs; it requires GitHub read access. Both archives use release study-artifacts-v1.30.</w:t>
       </w:r>
     </w:p>
     <w:p>
@@ -13348,7 +13348,7 @@
                 <w:rPr>
                   <w:color w:val="0563C1"/>
                 </w:rPr>
-                <w:t>Evidence Companion</w:t>
+                <w:t>Online availability guide</w:t>
               </w:r>
             </w:hyperlink>
           </w:p>
@@ -13365,7 +13365,7 @@
               <w:rPr>
                 <w:sz w:val="18"/>
               </w:rPr>
-              <w:t>Current index and historical evidence</w:t>
+              <w:t>Shareable code, aggregate results and documentation</w:t>
             </w:r>
           </w:p>
         </w:tc>
@@ -13381,7 +13381,7 @@
               <w:rPr>
                 <w:sz w:val="18"/>
               </w:rPr>
-              <w:t>GitHub</w:t>
+              <w:t>Public GitHub</w:t>
             </w:r>
           </w:p>
         </w:tc>
@@ -13400,6 +13400,62 @@
               <w:spacing w:before="40" w:after="80" w:line="240" w:lineRule="auto"/>
             </w:pPr>
             <w:hyperlink r:id="rId7">
+              <w:r>
+                <w:rPr>
+                  <w:color w:val="0563C1"/>
+                </w:rPr>
+                <w:t>Evidence Companion</w:t>
+              </w:r>
+            </w:hyperlink>
+          </w:p>
+        </w:tc>
+        <w:tc>
+          <w:tcPr>
+            <w:tcW w:w="3240" w:type="dxa"/>
+          </w:tcPr>
+          <w:p>
+            <w:pPr>
+              <w:spacing w:before="40" w:after="80" w:line="240" w:lineRule="auto"/>
+            </w:pPr>
+            <w:r>
+              <w:rPr>
+                <w:sz w:val="18"/>
+              </w:rPr>
+              <w:t>Current index and historical evidence</w:t>
+            </w:r>
+          </w:p>
+        </w:tc>
+        <w:tc>
+          <w:tcPr>
+            <w:tcW w:w="3240" w:type="dxa"/>
+          </w:tcPr>
+          <w:p>
+            <w:pPr>
+              <w:spacing w:before="40" w:after="80" w:line="240" w:lineRule="auto"/>
+            </w:pPr>
+            <w:r>
+              <w:rPr>
+                <w:sz w:val="18"/>
+              </w:rPr>
+              <w:t>Private; read access</w:t>
+            </w:r>
+          </w:p>
+        </w:tc>
+      </w:tr>
+      <w:tr>
+        <w:trPr>
+          <w:cantSplit/>
+          <w:jc w:val="center"/>
+        </w:trPr>
+        <w:tc>
+          <w:tcPr>
+            <w:tcW w:w="1944" w:type="dxa"/>
+          </w:tcPr>
+          <w:p>
+            <w:pPr>
+              <w:spacing w:before="40" w:after="80" w:line="240" w:lineRule="auto"/>
+            </w:pPr>
+            <w:hyperlink r:id="rId8">
               <w:r>
                 <w:rPr>
                   <w:color w:val="0563C1"/>
@@ -13437,7 +13493,7 @@
               <w:rPr>
                 <w:sz w:val="18"/>
               </w:rPr>
-              <w:t>GitHub</w:t>
+              <w:t>Private; read access</w:t>
             </w:r>
           </w:p>
         </w:tc>
@@ -13455,7 +13511,7 @@
             <w:pPr>
               <w:spacing w:before="40" w:after="80" w:line="240" w:lineRule="auto"/>
             </w:pPr>
-            <w:hyperlink r:id="rId8">
+            <w:hyperlink r:id="rId9">
               <w:r>
                 <w:rPr>
                   <w:color w:val="0563C1"/>
@@ -13493,7 +13549,7 @@
               <w:rPr>
                 <w:sz w:val="18"/>
               </w:rPr>
-              <w:t>GitHub and release</w:t>
+              <w:t>Private; read access</w:t>
             </w:r>
           </w:p>
         </w:tc>
@@ -13511,7 +13567,7 @@
             <w:pPr>
               <w:spacing w:before="40" w:after="80" w:line="240" w:lineRule="auto"/>
             </w:pPr>
-            <w:hyperlink r:id="rId9" w:anchor="security-validation">
+            <w:hyperlink r:id="rId10" w:anchor="security-validation">
               <w:r>
                 <w:rPr>
                   <w:color w:val="0563C1"/>
@@ -13549,7 +13605,7 @@
               <w:rPr>
                 <w:sz w:val="18"/>
               </w:rPr>
-              <w:t>GitHub</w:t>
+              <w:t>Private; read access</w:t>
             </w:r>
           </w:p>
         </w:tc>
@@ -13567,7 +13623,7 @@
             <w:pPr>
               <w:spacing w:before="40" w:after="80" w:line="240" w:lineRule="auto"/>
             </w:pPr>
-            <w:hyperlink r:id="rId10">
+            <w:hyperlink r:id="rId11">
               <w:r>
                 <w:rPr>
                   <w:color w:val="0563C1"/>
@@ -13605,7 +13661,7 @@
               <w:rPr>
                 <w:sz w:val="18"/>
               </w:rPr>
-              <w:t>GitHub</w:t>
+              <w:t>Private; read access</w:t>
             </w:r>
           </w:p>
         </w:tc>
@@ -13623,7 +13679,7 @@
             <w:pPr>
               <w:spacing w:before="40" w:after="80" w:line="240" w:lineRule="auto"/>
             </w:pPr>
-            <w:hyperlink r:id="rId11">
+            <w:hyperlink r:id="rId12">
               <w:r>
                 <w:rPr>
                   <w:rStyle w:val="Hyperlink"/>
@@ -13661,7 +13717,7 @@
               <w:rPr>
                 <w:sz w:val="18"/>
               </w:rPr>
-              <w:t>Versioned release</w:t>
+              <w:t>Private release; read access</w:t>
             </w:r>
           </w:p>
         </w:tc>
@@ -15118,8 +15174,8 @@
       </w:r>
     </w:p>
     <w:sectPr>
-      <w:headerReference w:type="default" r:id="rId12"/>
-      <w:footerReference w:type="default" r:id="rId13"/>
+      <w:headerReference w:type="default" r:id="rId13"/>
+      <w:footerReference w:type="default" r:id="rId14"/>
       <w:pgSz w:w="11906" w:h="16838"/>
       <w:pgMar w:top="1134" w:right="1134" w:bottom="1134" w:left="2268" w:header="454" w:footer="567" w:gutter="0"/>
       <w:pgNumType w:start="1"/>

</xml_diff>